<commit_message>
docx: rebuild with embedded figures and bibliography
</commit_message>
<xml_diff>
--- a/paper/nature_universal_laws.docx
+++ b/paper/nature_universal_laws.docx
@@ -15634,6 +15634,584 @@
       </w:r>
       <w:r>
         <w:t xml:space="preserve">research possible.</w:t>
+      </w:r>
+    </w:p>
+    <w:p>
+      <w:pPr>
+        <w:pStyle w:val="BodyText"/>
+      </w:pPr>
+      <w:r>
+        <w:t xml:space="preserve">10</w:t>
+      </w:r>
+    </w:p>
+    <w:p>
+      <w:pPr>
+        <w:pStyle w:val="BodyText"/>
+      </w:pPr>
+      <w:r>
+        <w:t xml:space="preserve">Particle Data Group</w:t>
+      </w:r>
+      <w:r>
+        <w:t xml:space="preserve">, S. Navas, et al.</w:t>
+      </w:r>
+      <w:r>
+        <w:t xml:space="preserve"> </w:t>
+      </w:r>
+      <w:r>
+        <w:t xml:space="preserve">Review of particle physics.</w:t>
+      </w:r>
+      <w:r>
+        <w:t xml:space="preserve"> </w:t>
+      </w:r>
+      <w:r>
+        <w:t xml:space="preserve">, 110:030001, 2024.</w:t>
+      </w:r>
+      <w:r>
+        <w:t xml:space="preserve"> </w:t>
+      </w:r>
+      <w:r>
+        <w:t xml:space="preserve">PDG 2024; source for all particle masses, couplings, CKM parameters.</w:t>
+      </w:r>
+    </w:p>
+    <w:p>
+      <w:pPr>
+        <w:pStyle w:val="BodyText"/>
+      </w:pPr>
+      <w:r>
+        <w:t xml:space="preserve">Albert Einstein.</w:t>
+      </w:r>
+      <w:r>
+        <w:t xml:space="preserve"> </w:t>
+      </w:r>
+      <w:r>
+        <w:t xml:space="preserve">Die grundlage der allgemeinen relativit</w:t>
+      </w:r>
+      <w:r>
+        <w:t xml:space="preserve">ä</w:t>
+      </w:r>
+      <w:r>
+        <w:t xml:space="preserve">tstheorie.</w:t>
+      </w:r>
+      <w:r>
+        <w:t xml:space="preserve"> </w:t>
+      </w:r>
+      <w:r>
+        <w:t xml:space="preserve">, 354(7):769–822, 1916.</w:t>
+      </w:r>
+    </w:p>
+    <w:p>
+      <w:pPr>
+        <w:pStyle w:val="BodyText"/>
+      </w:pPr>
+      <w:r>
+        <w:t xml:space="preserve">Claude E. Shannon.</w:t>
+      </w:r>
+      <w:r>
+        <w:t xml:space="preserve"> </w:t>
+      </w:r>
+      <w:r>
+        <w:t xml:space="preserve">A mathematical theory of communication.</w:t>
+      </w:r>
+      <w:r>
+        <w:t xml:space="preserve"> </w:t>
+      </w:r>
+      <w:r>
+        <w:t xml:space="preserve">, 27:379–423, 623–656, 1948.</w:t>
+      </w:r>
+    </w:p>
+    <w:p>
+      <w:pPr>
+        <w:pStyle w:val="BodyText"/>
+      </w:pPr>
+      <w:r>
+        <w:t xml:space="preserve">Ronald A. Fisher.</w:t>
+      </w:r>
+      <w:r>
+        <w:t xml:space="preserve"> </w:t>
+      </w:r>
+      <w:r>
+        <w:t xml:space="preserve">Theory of statistical estimation.</w:t>
+      </w:r>
+      <w:r>
+        <w:t xml:space="preserve"> </w:t>
+      </w:r>
+      <w:r>
+        <w:t xml:space="preserve">, 22:700–725, 1925.</w:t>
+      </w:r>
+    </w:p>
+    <w:p>
+      <w:pPr>
+        <w:pStyle w:val="BodyText"/>
+      </w:pPr>
+      <w:r>
+        <w:t xml:space="preserve">Calyampudi R. Rao.</w:t>
+      </w:r>
+      <w:r>
+        <w:t xml:space="preserve"> </w:t>
+      </w:r>
+      <w:r>
+        <w:t xml:space="preserve">Information and the accuracy attainable in the estimation of</w:t>
+      </w:r>
+      <w:r>
+        <w:t xml:space="preserve"> </w:t>
+      </w:r>
+      <w:r>
+        <w:t xml:space="preserve">statistical parameters.</w:t>
+      </w:r>
+      <w:r>
+        <w:t xml:space="preserve"> </w:t>
+      </w:r>
+      <w:r>
+        <w:t xml:space="preserve">, 37:81–91, 1945.</w:t>
+      </w:r>
+      <w:r>
+        <w:t xml:space="preserve"> </w:t>
+      </w:r>
+      <w:r>
+        <w:t xml:space="preserve">Introduced the Fisher–Rao metric in statistical manifolds.</w:t>
+      </w:r>
+    </w:p>
+    <w:p>
+      <w:pPr>
+        <w:pStyle w:val="BodyText"/>
+      </w:pPr>
+      <w:r>
+        <w:t xml:space="preserve">Alfr</w:t>
+      </w:r>
+      <w:r>
+        <w:t xml:space="preserve">é</w:t>
+      </w:r>
+      <w:r>
+        <w:t xml:space="preserve">d R</w:t>
+      </w:r>
+      <w:r>
+        <w:t xml:space="preserve">é</w:t>
+      </w:r>
+      <w:r>
+        <w:t xml:space="preserve">nyi.</w:t>
+      </w:r>
+      <w:r>
+        <w:t xml:space="preserve"> </w:t>
+      </w:r>
+      <w:r>
+        <w:t xml:space="preserve">On measures of entropy and information.</w:t>
+      </w:r>
+      <w:r>
+        <w:t xml:space="preserve"> </w:t>
+      </w:r>
+      <w:r>
+        <w:t xml:space="preserve">, 1:547–561, 1961.</w:t>
+      </w:r>
+    </w:p>
+    <w:p>
+      <w:pPr>
+        <w:pStyle w:val="BodyText"/>
+      </w:pPr>
+      <w:r>
+        <w:t xml:space="preserve">David J. Gross and Frank Wilczek.</w:t>
+      </w:r>
+      <w:r>
+        <w:t xml:space="preserve"> </w:t>
+      </w:r>
+      <w:r>
+        <w:t xml:space="preserve">Ultraviolet behavior of non-</w:t>
+      </w:r>
+      <w:r>
+        <w:t xml:space="preserve">Abelian</w:t>
+      </w:r>
+      <w:r>
+        <w:t xml:space="preserve"> </w:t>
+      </w:r>
+      <w:r>
+        <w:t xml:space="preserve">gauge theories.</w:t>
+      </w:r>
+      <w:r>
+        <w:t xml:space="preserve"> </w:t>
+      </w:r>
+      <w:r>
+        <w:t xml:space="preserve">, 30:1343–1346, 1973.</w:t>
+      </w:r>
+    </w:p>
+    <w:p>
+      <w:pPr>
+        <w:pStyle w:val="BodyText"/>
+      </w:pPr>
+      <w:r>
+        <w:t xml:space="preserve">H. David Politzer.</w:t>
+      </w:r>
+      <w:r>
+        <w:t xml:space="preserve"> </w:t>
+      </w:r>
+      <w:r>
+        <w:t xml:space="preserve">Reliable perturbative results for strong interactions?</w:t>
+      </w:r>
+      <w:r>
+        <w:t xml:space="preserve"> </w:t>
+      </w:r>
+      <w:r>
+        <w:t xml:space="preserve">, 30:1346–1349, 1973.</w:t>
+      </w:r>
+    </w:p>
+    <w:p>
+      <w:pPr>
+        <w:pStyle w:val="BodyText"/>
+      </w:pPr>
+      <w:r>
+        <w:t xml:space="preserve">Godfrey H. Hardy, John E. Littlewood, and George P</w:t>
+      </w:r>
+      <w:r>
+        <w:t xml:space="preserve">ó</w:t>
+      </w:r>
+      <w:r>
+        <w:t xml:space="preserve">lya.</w:t>
+      </w:r>
+      <w:r>
+        <w:t xml:space="preserve"> </w:t>
+      </w:r>
+      <w:r>
+        <w:t xml:space="preserve">.</w:t>
+      </w:r>
+      <w:r>
+        <w:t xml:space="preserve"> </w:t>
+      </w:r>
+      <w:r>
+        <w:t xml:space="preserve">Cambridge University Press, 2nd edition, 1952.</w:t>
+      </w:r>
+    </w:p>
+    <w:p>
+      <w:pPr>
+        <w:pStyle w:val="BodyText"/>
+      </w:pPr>
+      <w:r>
+        <w:t xml:space="preserve">Kenneth G. Wilson.</w:t>
+      </w:r>
+      <w:r>
+        <w:t xml:space="preserve"> </w:t>
+      </w:r>
+      <w:r>
+        <w:t xml:space="preserve">Confinement of quarks.</w:t>
+      </w:r>
+      <w:r>
+        <w:t xml:space="preserve"> </w:t>
+      </w:r>
+      <w:r>
+        <w:t xml:space="preserve">, 10:2445–2459, 1974.</w:t>
+      </w:r>
+      <w:r>
+        <w:t xml:space="preserve"> </w:t>
+      </w:r>
+      <w:r>
+        <w:t xml:space="preserve">Lattice gauge theory; Wilson loop confinement criterion.</w:t>
+      </w:r>
+    </w:p>
+    <w:p>
+      <w:pPr>
+        <w:pStyle w:val="BodyText"/>
+      </w:pPr>
+      <w:r>
+        <w:t xml:space="preserve">Y. Aoki, G. Endrődi, Z. Fodor, S. D. Katz, and K. K. Szabó.</w:t>
+      </w:r>
+      <w:r>
+        <w:t xml:space="preserve"> </w:t>
+      </w:r>
+      <w:r>
+        <w:t xml:space="preserve">The order of the quantum chromodynamics transition predicted by the</w:t>
+      </w:r>
+      <w:r>
+        <w:t xml:space="preserve"> </w:t>
+      </w:r>
+      <w:r>
+        <w:t xml:space="preserve">standard model of particle physics.</w:t>
+      </w:r>
+      <w:r>
+        <w:t xml:space="preserve"> </w:t>
+      </w:r>
+      <w:r>
+        <w:t xml:space="preserve">, 443:675–678, 2006.</w:t>
+      </w:r>
+      <w:r>
+        <w:t xml:space="preserve"> </w:t>
+      </w:r>
+      <w:r>
+        <w:t xml:space="preserve">Lattice QCD: crossover at</w:t>
+      </w:r>
+      <w:r>
+        <w:t xml:space="preserve"> </w:t>
+      </w:r>
+      <m:oMath>
+        <m:sSub>
+          <m:e>
+            <m:r>
+              <m:t>T</m:t>
+            </m:r>
+          </m:e>
+          <m:sub>
+            <m:r>
+              <m:t>c</m:t>
+            </m:r>
+          </m:sub>
+        </m:sSub>
+        <m:r>
+          <m:rPr>
+            <m:sty m:val="p"/>
+          </m:rPr>
+          <m:t>≈</m:t>
+        </m:r>
+        <m:r>
+          <m:t>155</m:t>
+        </m:r>
+      </m:oMath>
+      <w:r>
+        <w:t xml:space="preserve"> MeV (not first-order).</w:t>
+      </w:r>
+    </w:p>
+    <w:p>
+      <w:pPr>
+        <w:pStyle w:val="BodyText"/>
+      </w:pPr>
+      <w:r>
+        <w:t xml:space="preserve">Ernst Hellinger.</w:t>
+      </w:r>
+      <w:r>
+        <w:t xml:space="preserve"> </w:t>
+      </w:r>
+      <w:r>
+        <w:t xml:space="preserve">Neue begr</w:t>
+      </w:r>
+      <w:r>
+        <w:t xml:space="preserve">ü</w:t>
+      </w:r>
+      <w:r>
+        <w:t xml:space="preserve">ndung der theorie quadratischer formen von</w:t>
+      </w:r>
+      <w:r>
+        <w:t xml:space="preserve"> </w:t>
+      </w:r>
+      <w:r>
+        <w:t xml:space="preserve">unendlichvielen ver</w:t>
+      </w:r>
+      <w:r>
+        <w:t xml:space="preserve">ä</w:t>
+      </w:r>
+      <w:r>
+        <w:t xml:space="preserve">nderlichen.</w:t>
+      </w:r>
+      <w:r>
+        <w:t xml:space="preserve"> </w:t>
+      </w:r>
+      <w:r>
+        <w:t xml:space="preserve">,</w:t>
+      </w:r>
+      <w:r>
+        <w:t xml:space="preserve"> </w:t>
+      </w:r>
+      <w:r>
+        <w:t xml:space="preserve">136:210–271, 1909.</w:t>
+      </w:r>
+      <w:r>
+        <w:t xml:space="preserve"> </w:t>
+      </w:r>
+      <w:r>
+        <w:t xml:space="preserve">Introduced the Hellinger distance / integral.</w:t>
+      </w:r>
+    </w:p>
+    <w:p>
+      <w:pPr>
+        <w:pStyle w:val="BodyText"/>
+      </w:pPr>
+      <w:r>
+        <w:t xml:space="preserve">Shun-ichi Amari.</w:t>
+      </w:r>
+      <w:r>
+        <w:t xml:space="preserve"> </w:t>
+      </w:r>
+      <w:r>
+        <w:t xml:space="preserve">.</w:t>
+      </w:r>
+      <w:r>
+        <w:t xml:space="preserve"> </w:t>
+      </w:r>
+      <w:r>
+        <w:t xml:space="preserve">Springer, 2016.</w:t>
+      </w:r>
+    </w:p>
+    <w:p>
+      <w:pPr>
+        <w:pStyle w:val="BodyText"/>
+      </w:pPr>
+      <w:r>
+        <w:t xml:space="preserve">Girolamo Cardano.</w:t>
+      </w:r>
+      <w:r>
+        <w:t xml:space="preserve"> </w:t>
+      </w:r>
+      <w:r>
+        <w:t xml:space="preserve">.</w:t>
+      </w:r>
+      <w:r>
+        <w:t xml:space="preserve"> </w:t>
+      </w:r>
+      <w:r>
+        <w:t xml:space="preserve">Johann Petreius, Nuremberg, 1545.</w:t>
+      </w:r>
+      <w:r>
+        <w:t xml:space="preserve"> </w:t>
+      </w:r>
+      <w:r>
+        <w:t xml:space="preserve">First published solution of the depressed cubic</w:t>
+      </w:r>
+      <w:r>
+        <w:t xml:space="preserve"> </w:t>
+      </w:r>
+      <m:oMath>
+        <m:sSup>
+          <m:e>
+            <m:r>
+              <m:t>x</m:t>
+            </m:r>
+          </m:e>
+          <m:sup>
+            <m:r>
+              <m:t>3</m:t>
+            </m:r>
+          </m:sup>
+        </m:sSup>
+        <m:r>
+          <m:rPr>
+            <m:sty m:val="p"/>
+          </m:rPr>
+          <m:t>+</m:t>
+        </m:r>
+        <m:r>
+          <m:t>p</m:t>
+        </m:r>
+        <m:r>
+          <m:t>x</m:t>
+        </m:r>
+        <m:r>
+          <m:rPr>
+            <m:sty m:val="p"/>
+          </m:rPr>
+          <m:t>=</m:t>
+        </m:r>
+        <m:r>
+          <m:t>q</m:t>
+        </m:r>
+      </m:oMath>
+      <w:r>
+        <w:t xml:space="preserve">.</w:t>
+      </w:r>
+    </w:p>
+    <w:p>
+      <w:pPr>
+        <w:pStyle w:val="BodyText"/>
+      </w:pPr>
+      <w:r>
+        <w:t xml:space="preserve">Clement Paulus.</w:t>
+      </w:r>
+      <w:r>
+        <w:t xml:space="preserve"> </w:t>
+      </w:r>
+      <w:r>
+        <w:t xml:space="preserve">Universal measurement contract protocol.</w:t>
+      </w:r>
+      <w:r>
+        <w:t xml:space="preserve"> </w:t>
+      </w:r>
+      <w:r>
+        <w:t xml:space="preserve">Manuscript, 2025.</w:t>
+      </w:r>
+      <w:r>
+        <w:t xml:space="preserve"> </w:t>
+      </w:r>
+      <w:r>
+        <w:t xml:space="preserve">Contract-first measurement discipline; Tier-1 invariants reserved.</w:t>
+      </w:r>
+    </w:p>
+    <w:p>
+      <w:pPr>
+        <w:pStyle w:val="BodyText"/>
+      </w:pPr>
+      <w:r>
+        <w:t xml:space="preserve">Clement Paulus.</w:t>
+      </w:r>
+      <w:r>
+        <w:t xml:space="preserve"> </w:t>
+      </w:r>
+      <w:r>
+        <w:t xml:space="preserve">Generative-collapse-dynamics, 2026.</w:t>
+      </w:r>
+      <w:r>
+        <w:t xml:space="preserve"> </w:t>
+      </w:r>
+      <w:r>
+        <w:t xml:space="preserve">Reference implementation repository (GitHub).</w:t>
+      </w:r>
+    </w:p>
+    <w:p>
+      <w:pPr>
+        <w:pStyle w:val="BodyText"/>
+      </w:pPr>
+      <w:r>
+        <w:t xml:space="preserve">Clement Paulus.</w:t>
+      </w:r>
+      <w:r>
+        <w:t xml:space="preserve"> </w:t>
+      </w:r>
+      <w:r>
+        <w:t xml:space="preserve">The episteme of return, November 2025.</w:t>
+      </w:r>
+      <w:r>
+        <w:t xml:space="preserve"> </w:t>
+      </w:r>
+      <w:r>
+        <w:t xml:space="preserve">PRE canon anchor for UMCP/GCD.</w:t>
+      </w:r>
+    </w:p>
+    <w:p>
+      <w:pPr>
+        <w:pStyle w:val="BodyText"/>
+      </w:pPr>
+      <w:r>
+        <w:t xml:space="preserve">Clement Paulus.</w:t>
+      </w:r>
+      <w:r>
+        <w:t xml:space="preserve"> </w:t>
+      </w:r>
+      <w:r>
+        <w:t xml:space="preserve">The physics of coherence: Recursive collapse &amp; continuity laws,</w:t>
+      </w:r>
+      <w:r>
+        <w:t xml:space="preserve"> </w:t>
+      </w:r>
+      <w:r>
+        <w:t xml:space="preserve">December 2025.</w:t>
+      </w:r>
+      <w:r>
+        <w:t xml:space="preserve"> </w:t>
+      </w:r>
+      <w:r>
+        <w:t xml:space="preserve">POST canon anchor; Weld-ID: W-2025-12-31-PHYS-COHERENCE.</w:t>
+      </w:r>
+    </w:p>
+    <w:p>
+      <w:pPr>
+        <w:pStyle w:val="BodyText"/>
+      </w:pPr>
+      <w:r>
+        <w:t xml:space="preserve">Clement Paulus.</w:t>
+      </w:r>
+      <w:r>
+        <w:t xml:space="preserve"> </w:t>
+      </w:r>
+      <w:r>
+        <w:t xml:space="preserve">Umcp casepack publication, 2026.</w:t>
+      </w:r>
+      <w:r>
+        <w:t xml:space="preserve"> </w:t>
+      </w:r>
+      <w:r>
+        <w:t xml:space="preserve">Runnable CasePack publication anchor.</w:t>
       </w:r>
     </w:p>
     <w:bookmarkEnd w:id="67"/>

</xml_diff>